<commit_message>
feat: Implementar soporte para columnas extra en la lectura de Google Sheets
- Agregar la opción de columnas extra en la configuración de GoogleSheetsOptions.
- Modificar la clase FilaCruda para incluir valores de columnas extra.
- Actualizar RowParser para manejar columnas extra y priorizar su contenido sobre grupos de regex.
- Cambiar la interfaz ISheetSource para leer filas completas en lugar de solo una columna.
- Ajustar SyncCoordinator y SheetCache para trabajar con el nuevo formato de datos.
- Actualizar pruebas unitarias para reflejar los cambios en la estructura de datos y la lógica de parsing.
- Modificar appsettings.json para incluir ejemplos de configuración de columnas extra.
</commit_message>
<xml_diff>
--- a/client/DocGenApp/Templates/plantilla.docx
+++ b/client/DocGenApp/Templates/plantilla.docx
@@ -32,6 +32,14 @@
     </w:p>
     <w:p>
       <w:r>
+        <w:rPr>
+          <w:b/>
+        </w:rPr>
+        <w:t xml:space="preserve">De la hoja:</w:t>
+      </w:r>
+    </w:p>
+    <w:p>
+      <w:r>
         <w:t xml:space="preserve">Consecutivo: {{consecutivo}}</w:t>
       </w:r>
     </w:p>
@@ -43,6 +51,39 @@
     <w:p>
       <w:r>
         <w:t xml:space="preserve">Circuito: {{circuito}}</w:t>
+      </w:r>
+    </w:p>
+    <w:p>
+      <w:r>
+        <w:t xml:space="preserve">Nombre: {{nombre}}</w:t>
+      </w:r>
+    </w:p>
+    <w:p>
+      <w:r>
+        <w:t xml:space="preserve"/>
+      </w:r>
+    </w:p>
+    <w:p>
+      <w:r>
+        <w:rPr>
+          <w:b/>
+        </w:rPr>
+        <w:t xml:space="preserve">Del abogado (se capturan en la app, no en la hoja):</w:t>
+      </w:r>
+    </w:p>
+    <w:p>
+      <w:r>
+        <w:t xml:space="preserve">Nombre del abogado: {{abogadoNombre}}</w:t>
+      </w:r>
+    </w:p>
+    <w:p>
+      <w:r>
+        <w:t xml:space="preserve">Usuario FIREL: {{abogadoFirel}}</w:t>
+      </w:r>
+    </w:p>
+    <w:p>
+      <w:r>
+        <w:t xml:space="preserve">Cédula profesional: {{abogadoCedula}}</w:t>
       </w:r>
     </w:p>
     <w:p>

</xml_diff>

<commit_message>
Se añade a la interfaz la forma de ocultar
</commit_message>
<xml_diff>
--- a/client/DocGenApp/Templates/plantilla.docx
+++ b/client/DocGenApp/Templates/plantilla.docx
@@ -15,7 +15,6 @@
           <w:szCs w:val="24"/>
         </w:rPr>
       </w:pPr>
-      <w:r/>
       <w:r>
         <w:rPr>
           <w:b/>
@@ -328,6 +327,8 @@
         <w:ind/>
         <w:jc w:val="both"/>
         <w:rPr>
+          <w:b w:val="0"/>
+          <w:bCs w:val="0"/>
           <w:sz w:val="24"/>
           <w:szCs w:val="24"/>
         </w:rPr>
@@ -356,10 +357,21 @@
           <w:sz w:val="24"/>
           <w:szCs w:val="24"/>
         </w:rPr>
-        <w:t xml:space="preserve">, </w:t>
+        <w:t xml:space="preserve">,</w:t>
       </w:r>
       <w:r>
         <w:rPr>
+          <w:b/>
+          <w:bCs/>
+          <w:sz w:val="24"/>
+          <w:szCs w:val="24"/>
+        </w:rPr>
+        <w:t xml:space="preserve"> </w:t>
+      </w:r>
+      <w:r>
+        <w:rPr>
+          <w:b w:val="0"/>
+          <w:bCs w:val="0"/>
           <w:sz w:val="24"/>
           <w:szCs w:val="24"/>
         </w:rPr>
@@ -367,6 +379,8 @@
       </w:r>
       <w:r>
         <w:rPr>
+          <w:b w:val="0"/>
+          <w:bCs w:val="0"/>
           <w:sz w:val="24"/>
           <w:szCs w:val="24"/>
         </w:rPr>
@@ -374,12 +388,16 @@
       </w:r>
       <w:r>
         <w:rPr>
+          <w:b w:val="0"/>
+          <w:bCs w:val="0"/>
           <w:sz w:val="24"/>
           <w:szCs w:val="24"/>
         </w:rPr>
       </w:r>
       <w:r>
         <w:rPr>
+          <w:b w:val="0"/>
+          <w:bCs w:val="0"/>
           <w:sz w:val="24"/>
           <w:szCs w:val="24"/>
         </w:rPr>
@@ -619,7 +637,7 @@
           <w:sz w:val="24"/>
           <w:szCs w:val="24"/>
         </w:rPr>
-        <w:t xml:space="preserve">cuenta con la cédula profesional número </w:t>
+        <w:t xml:space="preserve">con la cédula profesional número </w:t>
       </w:r>
       <w:r>
         <w:rPr>
@@ -633,20 +651,13 @@
       </w:r>
       <w:r>
         <w:rPr>
-          <w:sz w:val="24"/>
-          <w:szCs w:val="24"/>
-        </w:rPr>
-        <w:t xml:space="preserve"> expedida por la autoridad competente, y que la Licenciada </w:t>
-      </w:r>
-      <w:r>
-        <w:rPr>
           <w:b/>
           <w:bCs/>
           <w:sz w:val="24"/>
           <w:szCs w:val="24"/>
           <w:u w:val="single"/>
         </w:rPr>
-        <w:t xml:space="preserve">{{abogado2Nombre}}</w:t>
+        <w:t xml:space="preserve"> así como a {{abogado2Nombre}}</w:t>
       </w:r>
       <w:r>
         <w:rPr>
@@ -673,7 +684,7 @@
           <w:sz w:val="24"/>
           <w:szCs w:val="24"/>
         </w:rPr>
-        <w:t xml:space="preserve">cuenta con la cédula profesional número </w:t>
+        <w:t xml:space="preserve">con la cédula profesional número </w:t>
       </w:r>
       <w:r>
         <w:rPr>
@@ -1046,46 +1057,13 @@
           <w:sz w:val="24"/>
           <w:szCs w:val="24"/>
         </w:rPr>
-        <w:t xml:space="preserve"> y</w:t>
-      </w:r>
-      <w:r>
-        <w:rPr>
-          <w:sz w:val="24"/>
-          <w:szCs w:val="24"/>
-        </w:rPr>
         <w:t xml:space="preserve">, previos los trámites de ley, acordar de conformidad la autorización solicitada, reconociéndoles las facultades previstas en el artículo 12 de la Ley de Amparo.</w:t>
       </w:r>
       <w:r>
         <w:rPr>
           <w:sz w:val="24"/>
           <w:szCs w:val="24"/>
-        </w:rPr>
-      </w:r>
-      <w:r>
-        <w:rPr>
-          <w:sz w:val="24"/>
-          <w:szCs w:val="24"/>
           <w:highlight w:val="none"/>
-        </w:rPr>
-      </w:r>
-      <w:r>
-        <w:rPr>
-          <w:sz w:val="24"/>
-          <w:szCs w:val="24"/>
-          <w:highlight w:val="none"/>
-        </w:rPr>
-      </w:r>
-      <w:r>
-        <w:rPr>
-          <w:sz w:val="24"/>
-          <w:szCs w:val="24"/>
-          <w:highlight w:val="none"/>
-        </w:rPr>
-      </w:r>
-      <w:r>
-        <w:rPr>
-          <w:sz w:val="24"/>
-          <w:szCs w:val="24"/>
         </w:rPr>
       </w:r>
       <w:r>

</xml_diff>

<commit_message>
feat: Update document template and enhance print marking functionality
</commit_message>
<xml_diff>
--- a/client/DocGenApp/Templates/plantilla.docx
+++ b/client/DocGenApp/Templates/plantilla.docx
@@ -214,16 +214,6 @@
           <w:sz w:val="24"/>
           <w:szCs w:val="24"/>
         </w:rPr>
-        <w:t xml:space="preserve"> </w:t>
-      </w:r>
-      <w:r>
-        <w:rPr>
-          <w:b/>
-          <w:bCs/>
-          <w:sz w:val="24"/>
-          <w:szCs w:val="24"/>
-        </w:rPr>
-        <w:t xml:space="preserve">CIRCUITO</w:t>
       </w:r>
       <w:r>
         <w:rPr>

</xml_diff>

<commit_message>
Refactor ParsedFields and RegistroDto models for clarity and remove unused RowParser service
- Updated ParsedFields to reflect direct column values from the sheet, removing regex references.
- Simplified RegistroDto to only include necessary properties, removing ValorCrudo and PatronUsado.
- Removed ErrorParseoDto as it is no longer used in the sync process.
- Adjusted SyncResult and SyncCoordinator to reflect changes in data handling.
- Removed SyncBackgroundService and related polling logic, transitioning to manual sync only.
- Updated GoogleSheetSource to validate column configurations and handle errors more robustly.
- Refactored SheetCache and ImpresosStore to include origin tracking for data consistency.
- Updated appsettings to reflect new configuration structure for columns.
</commit_message>
<xml_diff>
--- a/client/DocGenApp/Templates/plantilla.docx
+++ b/client/DocGenApp/Templates/plantilla.docx
@@ -140,6 +140,7 @@
           <w:sz w:val="24"/>
           <w:szCs w:val="24"/>
         </w:rPr>
+        <w:t xml:space="preserve">{{</w:t>
       </w:r>
       <w:r>
         <w:rPr>
@@ -147,8 +148,9 @@
           <w:bCs/>
           <w:sz w:val="24"/>
           <w:szCs w:val="24"/>
+          <w:lang w:val="en-US"/>
         </w:rPr>
-        <w:t xml:space="preserve">{{colegio}}</w:t>
+        <w:t xml:space="preserve">circuito</w:t>
       </w:r>
       <w:r>
         <w:rPr>
@@ -156,81 +158,9 @@
           <w:bCs/>
           <w:sz w:val="24"/>
           <w:szCs w:val="24"/>
+          <w:lang w:val="en-US"/>
         </w:rPr>
-        <w:t xml:space="preserve"> TRIBUNAL COLEGIADO EN MATERIA </w:t>
-      </w:r>
-      <w:r>
-        <w:rPr>
-          <w:b/>
-          <w:bCs/>
-          <w:sz w:val="24"/>
-          <w:szCs w:val="24"/>
-        </w:rPr>
-      </w:r>
-      <w:r>
-        <w:rPr>
-          <w:b/>
-          <w:bCs/>
-          <w:sz w:val="24"/>
-          <w:szCs w:val="24"/>
-        </w:rPr>
-      </w:r>
-    </w:p>
-    <w:p>
-      <w:pPr>
-        <w:pBdr/>
-        <w:spacing w:after="0" w:line="276" w:lineRule="auto"/>
-        <w:ind/>
-        <w:jc w:val="both"/>
-        <w:rPr>
-          <w:b/>
-          <w:bCs/>
-          <w:sz w:val="24"/>
-          <w:szCs w:val="24"/>
-        </w:rPr>
-      </w:pPr>
-      <w:r>
-        <w:rPr>
-          <w:b/>
-          <w:bCs/>
-          <w:sz w:val="24"/>
-          <w:szCs w:val="24"/>
-        </w:rPr>
-        <w:t xml:space="preserve">ADMINISTRATIVA DEL </w:t>
-      </w:r>
-      <w:r>
-        <w:rPr>
-          <w:b/>
-          <w:bCs/>
-          <w:sz w:val="24"/>
-          <w:szCs w:val="24"/>
-        </w:rPr>
-        <w:t xml:space="preserve">{{circuito}}</w:t>
-      </w:r>
-      <w:r>
-        <w:rPr>
-          <w:b/>
-          <w:bCs/>
-          <w:sz w:val="24"/>
-          <w:szCs w:val="24"/>
-        </w:rPr>
-      </w:r>
-      <w:r>
-        <w:rPr>
-          <w:b/>
-          <w:bCs/>
-          <w:sz w:val="24"/>
-          <w:szCs w:val="24"/>
-        </w:rPr>
-        <w:t xml:space="preserve">. </w:t>
-      </w:r>
-      <w:r>
-        <w:rPr>
-          <w:b/>
-          <w:bCs/>
-          <w:sz w:val="24"/>
-          <w:szCs w:val="24"/>
-        </w:rPr>
+        <w:t xml:space="preserve">}}</w:t>
       </w:r>
       <w:r>
         <w:rPr>

</xml_diff>